<commit_message>
chore(cv): CVs de Dados/IA com links dos repositórios e metadados
Link de cada projeto no título, 53 testes e 97% de cobertura na API,
split por lesão com StratifiedGroupKFold, NumPy/Pandas citados e título e
autor nas propriedades do arquivo. PT e EN.
</commit_message>
<xml_diff>
--- a/public/cv/CV-Claudinei-Alves-Reis-EN.docx
+++ b/public/cv/CV-Claudinei-Alves-Reis-EN.docx
@@ -2,7 +2,7 @@
 <file path=word/document.xml><?xml version="1.0" encoding="utf-8"?>
 <w:document xmlns:w="http://schemas.openxmlformats.org/wordprocessingml/2006/main" xmlns:m="http://schemas.openxmlformats.org/officeDocument/2006/math" xmlns:r="http://schemas.openxmlformats.org/officeDocument/2006/relationships" xmlns:o="urn:schemas-microsoft-com:office:office" xmlns:v="urn:schemas-microsoft-com:vml" xmlns:w10="urn:schemas-microsoft-com:office:word" xmlns:a="http://schemas.openxmlformats.org/drawingml/2006/main" xmlns:pic="http://schemas.openxmlformats.org/drawingml/2006/picture" xmlns:wp="http://schemas.openxmlformats.org/drawingml/2006/wordprocessingDrawing">
   <w:body>
-    <w:bookmarkStart w:id="23" w:name="claudinei-alves-reis"/>
+    <w:bookmarkStart w:id="26" w:name="claudinei-alves-reis"/>
     <w:p>
       <w:pPr>
         <w:pStyle w:val="Heading1"/>
@@ -218,12 +218,12 @@
         </w:numPr>
       </w:pPr>
       <w:r>
-        <w:t xml:space="preserve">Presented Skin Analyser AI, an app that classifies skin cancer with AI, at fairs such as 3M and Bragantec, translating technical results for non-technical audiences.</w:t>
+        <w:t xml:space="preserve">Presented Skin Analyser AI, an AI app for skin lesion triage, at fairs such as 3M and Bragantec, translating technical results for non-technical audiences.</w:t>
       </w:r>
     </w:p>
     <w:bookmarkEnd w:id="15"/>
     <w:bookmarkEnd w:id="16"/>
-    <w:bookmarkStart w:id="20" w:name="projects"/>
+    <w:bookmarkStart w:id="23" w:name="projects"/>
     <w:p>
       <w:pPr>
         <w:pStyle w:val="Heading2"/>
@@ -232,21 +232,32 @@
         <w:t xml:space="preserve">Projects</w:t>
       </w:r>
     </w:p>
-    <w:bookmarkStart w:id="17" w:name="Xc24920f0f22e0c2d3afdced967339e4e3898b32"/>
+    <w:bookmarkStart w:id="18" w:name="X0897f508520f970fd2c5a9fc042172f63a1f808"/>
     <w:p>
       <w:pPr>
         <w:pStyle w:val="Heading3"/>
       </w:pPr>
       <w:r>
-        <w:t xml:space="preserve">Skin Analyser — AI Skin Lesion Triage — 2025–2026</w:t>
-      </w:r>
+        <w:t xml:space="preserve">Skin Analyser — AI Skin Lesion Triage — 2025–2026 ·</w:t>
+      </w:r>
+      <w:r>
+        <w:t xml:space="preserve"> </w:t>
+      </w:r>
+      <w:hyperlink r:id="rId17">
+        <w:r>
+          <w:rPr>
+            <w:rStyle w:val="Hyperlink"/>
+          </w:rPr>
+          <w:t xml:space="preserve">github.com/ClaudineiAlves/skin-analyser</w:t>
+        </w:r>
+      </w:hyperlink>
     </w:p>
     <w:p>
       <w:pPr>
         <w:pStyle w:val="FirstParagraph"/>
       </w:pPr>
       <w:r>
-        <w:t xml:space="preserve">Python · TensorFlow/Keras · Scikit-learn · OpenCV · Pandas · NumPy · Supabase</w:t>
+        <w:t xml:space="preserve">Python · TensorFlow/Keras · Scikit-learn · OpenCV · Pandas · NumPy · Supabase · Kaggle</w:t>
       </w:r>
     </w:p>
     <w:p>
@@ -258,7 +269,7 @@
         </w:numPr>
       </w:pPr>
       <w:r>
-        <w:t xml:space="preserve">Built the image preprocessing for the HAM10000 dataset with OpenCV — resizing, normalization and augmentation — standardizing the input for every architecture tested.</w:t>
+        <w:t xml:space="preserve">Implemented the HAM10000 image preprocessing with OpenCV and NumPy — resizing, normalization and augmentation — standardizing the input for every architecture tested.</w:t>
       </w:r>
     </w:p>
     <w:p>
@@ -270,16 +281,7 @@
         </w:numPr>
       </w:pPr>
       <w:r>
-        <w:t xml:space="preserve">Split training, validation and test sets by lesion (</w:t>
-      </w:r>
-      <w:r>
-        <w:rPr>
-          <w:rStyle w:val="VerbatimChar"/>
-        </w:rPr>
-        <w:t xml:space="preserve">lesion_id</w:t>
-      </w:r>
-      <w:r>
-        <w:t xml:space="preserve">) with class stratification to prevent data leakage: photos of the same lesion never land in different sets.</w:t>
+        <w:t xml:space="preserve">Split training, validation and test sets by lesion with Pandas and StratifiedGroupKFold to prevent data leakage: none of the 7,470 HAM10000 lesions appears in more than one set.</w:t>
       </w:r>
     </w:p>
     <w:p>
@@ -291,7 +293,7 @@
         </w:numPr>
       </w:pPr>
       <w:r>
-        <w:t xml:space="preserve">Compared 8 convolutional neural network architectures with transfer learning (VGG19, ResNet50, DenseNet121, EfficientNetB0, InceptionV3, MobileNetV2, Xception and NASNetMobile) under an identical protocol, choosing the winner by metric.</w:t>
+        <w:t xml:space="preserve">Compared 8 CNN architectures with transfer learning (VGG19, ResNet50, DenseNet121, EfficientNetB0, InceptionV3, MobileNetV2, Xception and NASNetMobile) under an identical protocol, switching models by configuration only.</w:t>
       </w:r>
     </w:p>
     <w:p>
@@ -315,7 +317,7 @@
         </w:numPr>
       </w:pPr>
       <w:r>
-        <w:t xml:space="preserve">Evaluated the models by F1-score, recall, AUC and per-class confusion matrix, prioritizing recall on the highest-risk class: 73% recall and 0.85 AUC for melanoma (ResNet50).</w:t>
+        <w:t xml:space="preserve">Retrained ResNet50, EfficientNetB0 and DenseNet121 on a Kaggle GPU, evaluated them by F1, recall, AUC and confusion matrix, and documented results and limits on GitHub: ResNet50 won, with 73% recall and 0.85 AUC on melanoma, the highest-risk class.</w:t>
       </w:r>
     </w:p>
     <w:p>
@@ -330,15 +332,26 @@
         <w:t xml:space="preserve">Persisted runs and metrics in Supabase and exposed daily KPIs — accuracy, sensitivity and specificity — in a dashboard built on PostgreSQL materialized views.</w:t>
       </w:r>
     </w:p>
-    <w:bookmarkEnd w:id="17"/>
-    <w:bookmarkStart w:id="18" w:name="local-llm-email-triage-agent-2026"/>
+    <w:bookmarkEnd w:id="18"/>
+    <w:bookmarkStart w:id="20" w:name="X95050578111f00f4424bf1cf8efca815d08c4cf"/>
     <w:p>
       <w:pPr>
         <w:pStyle w:val="Heading3"/>
       </w:pPr>
       <w:r>
-        <w:t xml:space="preserve">Local-LLM Email Triage Agent — 2026</w:t>
-      </w:r>
+        <w:t xml:space="preserve">Local-LLM Email Triage Agent — 2026 ·</w:t>
+      </w:r>
+      <w:r>
+        <w:t xml:space="preserve"> </w:t>
+      </w:r>
+      <w:hyperlink r:id="rId19">
+        <w:r>
+          <w:rPr>
+            <w:rStyle w:val="Hyperlink"/>
+          </w:rPr>
+          <w:t xml:space="preserve">github.com/ClaudineiAlves/triagem-email-llm</w:t>
+        </w:r>
+      </w:hyperlink>
     </w:p>
     <w:p>
       <w:pPr>
@@ -357,7 +370,7 @@
         </w:numPr>
       </w:pPr>
       <w:r>
-        <w:t xml:space="preserve">Built an agent that classifies incoming emails into 8 semantic categories with a local LLM, keeping the prompt, category descriptions and thresholds in versioned configuration, outside the execution flow.</w:t>
+        <w:t xml:space="preserve">Developed an agent that classifies incoming emails into 8 semantic categories with a local LLM, keeping the prompt, category descriptions and thresholds in versioned configuration, outside the execution flow.</w:t>
       </w:r>
     </w:p>
     <w:p>
@@ -369,7 +382,7 @@
         </w:numPr>
       </w:pPr>
       <w:r>
-        <w:t xml:space="preserve">Set a 0.6 confidence threshold with a manual review route: below it, the email goes to a review queue instead of receiving a guessed label.</w:t>
+        <w:t xml:space="preserve">Set a 0.6 confidence threshold and output validation (JSON and a label from the expected set): whatever fails goes to manual review instead of receiving a guessed label.</w:t>
       </w:r>
     </w:p>
     <w:p>
@@ -381,18 +394,29 @@
         </w:numPr>
       </w:pPr>
       <w:r>
-        <w:t xml:space="preserve">Diagnosed a silent failure in which the model invented labels outside the expected set, and fixed it by sizing the context window, measuring accuracy on a batch of real emails before and after the change.</w:t>
-      </w:r>
-    </w:p>
-    <w:bookmarkEnd w:id="18"/>
-    <w:bookmarkStart w:id="19" w:name="X51f35cd76b0b086bc6f94f397e9153c3521604b"/>
+        <w:t xml:space="preserve">Diagnosed a silent failure in which the model invented labels and got 1 of 16 cases right without raising any error: the context window was smaller than the prompt; fixed it by sizing the window to the prompt.</w:t>
+      </w:r>
+    </w:p>
+    <w:bookmarkEnd w:id="20"/>
+    <w:bookmarkStart w:id="22" w:name="X51f35cd76b0b086bc6f94f397e9153c3521604b"/>
     <w:p>
       <w:pPr>
         <w:pStyle w:val="Heading3"/>
       </w:pPr>
       <w:r>
-        <w:t xml:space="preserve">TransparênciaBR API — 2026 · github.com/ClaudineiAlves/transparenciabr-api</w:t>
-      </w:r>
+        <w:t xml:space="preserve">TransparênciaBR API — 2026 ·</w:t>
+      </w:r>
+      <w:r>
+        <w:t xml:space="preserve"> </w:t>
+      </w:r>
+      <w:hyperlink r:id="rId21">
+        <w:r>
+          <w:rPr>
+            <w:rStyle w:val="Hyperlink"/>
+          </w:rPr>
+          <w:t xml:space="preserve">github.com/ClaudineiAlves/transparenciabr-api</w:t>
+        </w:r>
+      </w:hyperlink>
     </w:p>
     <w:p>
       <w:pPr>
@@ -411,12 +435,12 @@
         </w:numPr>
       </w:pPr>
       <w:r>
-        <w:t xml:space="preserve">Built an async pipeline that ingests 4 public CGU datasets, validates and types the fields with Pydantic, and normalizes them into a relational PostgreSQL schema queryable by period, agency and amount.</w:t>
-      </w:r>
-    </w:p>
-    <w:bookmarkEnd w:id="19"/>
-    <w:bookmarkEnd w:id="20"/>
-    <w:bookmarkStart w:id="21" w:name="technical-skills"/>
+        <w:t xml:space="preserve">Built an async pipeline that ingests 4 public CGU datasets, validates the fields with Pydantic, normalizes dates and amounts and upserts them into PostgreSQL, with query routes by period, agency and amount.</w:t>
+      </w:r>
+    </w:p>
+    <w:bookmarkEnd w:id="22"/>
+    <w:bookmarkEnd w:id="23"/>
+    <w:bookmarkStart w:id="24" w:name="technical-skills"/>
     <w:p>
       <w:pPr>
         <w:pStyle w:val="Heading2"/>
@@ -488,7 +512,7 @@
         <w:t xml:space="preserve"> </w:t>
       </w:r>
       <w:r>
-        <w:t xml:space="preserve">TensorFlow/Keras, convolutional neural networks, transfer learning, stratified validation, classification metrics (F1, recall, AUC, confusion matrix)</w:t>
+        <w:t xml:space="preserve">TensorFlow/Keras, convolutional neural networks, transfer learning, stratified group validation, class weights, classification metrics (F1, recall, AUC, confusion matrix)</w:t>
       </w:r>
     </w:p>
     <w:p>
@@ -532,7 +556,7 @@
         <w:t xml:space="preserve"> </w:t>
       </w:r>
       <w:r>
-        <w:t xml:space="preserve">prompt engineering, text classification with a local model (Ollama), confidence thresholds and output evaluation</w:t>
+        <w:t xml:space="preserve">prompt engineering, text classification with a local model (Ollama), confidence thresholds and output validation</w:t>
       </w:r>
     </w:p>
     <w:p>
@@ -554,11 +578,11 @@
         <w:t xml:space="preserve"> </w:t>
       </w:r>
       <w:r>
-        <w:t xml:space="preserve">PostgreSQL, Supabase, Git, GitHub, Docker, Linux</w:t>
-      </w:r>
-    </w:p>
-    <w:bookmarkEnd w:id="21"/>
-    <w:bookmarkStart w:id="22" w:name="certifications"/>
+        <w:t xml:space="preserve">PostgreSQL, Supabase, Git, GitHub, Docker, Linux, Kaggle</w:t>
+      </w:r>
+    </w:p>
+    <w:bookmarkEnd w:id="24"/>
+    <w:bookmarkStart w:id="25" w:name="certifications"/>
     <w:p>
       <w:pPr>
         <w:pStyle w:val="Heading2"/>
@@ -591,8 +615,8 @@
         <w:t xml:space="preserve">Data Science Foundations — IBM SkillsBuild, 2026</w:t>
       </w:r>
     </w:p>
-    <w:bookmarkEnd w:id="22"/>
-    <w:bookmarkEnd w:id="23"/>
+    <w:bookmarkEnd w:id="25"/>
+    <w:bookmarkEnd w:id="26"/>
     <w:sectPr>
       <w:footnotePr>
         <w:numRestart w:val="eachSect"/>

</xml_diff>